<commit_message>
Corrigindo os últimos detalhes.
</commit_message>
<xml_diff>
--- a/Faculdade/Relatorio-Final.docx
+++ b/Faculdade/Relatorio-Final.docx
@@ -3439,7 +3439,7 @@
     </w:p>
     <w:p>
       <w:pPr>
-        <w:spacing w:line="360" w:lineRule="auto"/>
+        <w:spacing w:after="120" w:line="360" w:lineRule="auto"/>
         <w:ind w:firstLine="709"/>
         <w:jc w:val="both"/>
       </w:pPr>
@@ -3456,50 +3456,50 @@
     </w:p>
     <w:p>
       <w:pPr>
+        <w:spacing w:after="120" w:line="360" w:lineRule="auto"/>
+        <w:ind w:firstLine="709"/>
+        <w:jc w:val="both"/>
+      </w:pPr>
+      <w:r>
+        <w:t>Banco de Dados I e II: cursado no 2º e 3º semestre;</w:t>
+      </w:r>
+    </w:p>
+    <w:p>
+      <w:pPr>
+        <w:spacing w:after="120" w:line="360" w:lineRule="auto"/>
+        <w:ind w:firstLine="709"/>
+        <w:jc w:val="both"/>
+      </w:pPr>
+      <w:r>
+        <w:t>Comunicação e Expressão I e II: cursado no 1º e 2º semestre;</w:t>
+      </w:r>
+    </w:p>
+    <w:p>
+      <w:pPr>
+        <w:spacing w:after="120" w:line="360" w:lineRule="auto"/>
+        <w:ind w:firstLine="709"/>
+        <w:jc w:val="both"/>
+      </w:pPr>
+      <w:r>
+        <w:t>Gestão de Projetos: cursado no 3º semestre;</w:t>
+      </w:r>
+    </w:p>
+    <w:p>
+      <w:pPr>
+        <w:spacing w:after="120" w:line="360" w:lineRule="auto"/>
+        <w:ind w:firstLine="709"/>
+        <w:jc w:val="both"/>
+      </w:pPr>
+      <w:r>
+        <w:t>Qualidade de Software: cursado no 4º semestre.</w:t>
+      </w:r>
+    </w:p>
+    <w:p>
+      <w:pPr>
         <w:spacing w:line="360" w:lineRule="auto"/>
         <w:ind w:firstLine="1417"/>
         <w:jc w:val="both"/>
       </w:pPr>
-      <w:r>
-        <w:t>Banco de Dados I e II: cursado no 2º e 3º semestre;</w:t>
-      </w:r>
-    </w:p>
-    <w:p>
-      <w:pPr>
-        <w:spacing w:line="360" w:lineRule="auto"/>
-        <w:ind w:firstLine="1417"/>
-        <w:jc w:val="both"/>
-      </w:pPr>
-      <w:r>
-        <w:t>Comunicação e Expressão I e II: cursado no 1º e 2º semestre;</w:t>
-      </w:r>
-    </w:p>
-    <w:p>
-      <w:pPr>
-        <w:spacing w:line="360" w:lineRule="auto"/>
-        <w:ind w:firstLine="1417"/>
-        <w:jc w:val="both"/>
-      </w:pPr>
-      <w:r>
-        <w:t>Gestão de Projetos: cursado no 3º semestre;</w:t>
-      </w:r>
-    </w:p>
-    <w:p>
-      <w:pPr>
-        <w:spacing w:line="360" w:lineRule="auto"/>
-        <w:ind w:firstLine="1417"/>
-        <w:jc w:val="both"/>
-      </w:pPr>
-      <w:r>
-        <w:t>Qualidade de Software: cursado no 4º semestre.</w:t>
-      </w:r>
-    </w:p>
-    <w:p>
-      <w:pPr>
-        <w:spacing w:line="360" w:lineRule="auto"/>
-        <w:ind w:firstLine="1417"/>
-        <w:jc w:val="both"/>
-      </w:pPr>
     </w:p>
     <w:p>
       <w:pPr>
@@ -3508,7 +3508,6 @@
         <w:jc w:val="both"/>
       </w:pPr>
       <w:r>
-        <w:lastRenderedPageBreak/>
         <w:t>Abaixo está especificado a relação das atividades exercidas com as disciplinas correspondentes:</w:t>
       </w:r>
     </w:p>

</xml_diff>